<commit_message>
feat: 完善 reference.docx 样式定义
添加完整的 Word 文档样式配置：

正文样式：
- 中文字体：宋体
- 英文字体：Times New Roman
- 字号：小四号（12pt）
- 行距：1.5倍行距

标题样式：
- Heading1：黑体，三号（16pt），加粗，段前段后间距
- Heading2：黑体，四号（14pt），加粗，段前段后间距
- Heading3：黑体，小四号（12pt），加粗，段前段后间距
- Heading4：楷体，小四号（12pt），加粗，段前段后间距

列表样式：
- 无序列表：• o ■ 循环，正确的缩进
- 有序列表：1. → 1.1. → 1.1.1. 格式

影响：导出的 Word 文档具有专业的中文排版样式，
符合技术文档规范，可直接用于正式场合。
</commit_message>
<xml_diff>
--- a/templates/reference.docx
+++ b/templates/reference.docx
@@ -609,6 +609,15 @@
   <w:style w:type="paragraph" w:default="1" w:styleId="Normal">
     <w:name w:val="Normal"/>
     <w:qFormat/>
+    <w:pPr>
+      <w:widowControl w:val="0"/>
+      <w:spacing w:line="360" w:line-rule="auto"/>
+    </w:pPr>
+    <w:rPr>
+      <w:rFonts w:ascii="宋体" w:eastAsia="宋体" w:hAnsi="Times New Roman" w:cs="Times New Roman"/>
+      <w:sz w:val="24"/>
+      <w:szCs w:val="24"/>
+    </w:rPr>
   </w:style>
   <w:style w:type="paragraph" w:styleId="BodyText">
     <w:name w:val="Body Text"/>
@@ -1244,6 +1253,95 @@
       <w:color w:val="365F91" w:themeColor="accent1" w:themeShade="BF"/>
     </w:rPr>
   </w:style>
+  <!-- 标题1：三号黑体 -->
+  <w:style w:type="paragraph" w:styleId="Heading1">
+    <w:name w:val="heading 1"/>
+    <w:basedOn w:val="Normal"/>
+    <w:next w:val="Normal"/>
+    <w:link w:val="Heading1Char"/>
+    <w:uiPriority w:val="9"/>
+    <w:qFormat/>
+    <w:pPr>
+      <w:keepNext/>
+      <w:keepLines/>
+      <w:spacing w:before="340" w:after="330" w:line="578" w:line-rule="auto"/>
+      <w:outlineLvl w:val="0"/>
+    </w:pPr>
+    <w:rPr>
+      <w:rFonts w:ascii="黑体" w:eastAsia="黑体" w:hAnsi="黑体"/>
+      <w:b/>
+      <w:bCs/>
+      <w:sz w:val="32"/>
+      <w:szCs w:val="32"/>
+    </w:rPr>
+  </w:style>
+  <!-- 标题2：四号黑体 -->
+  <w:style w:type="paragraph" w:styleId="Heading2">
+    <w:name w:val="heading 2"/>
+    <w:basedOn w:val="Normal"/>
+    <w:next w:val="Normal"/>
+    <w:link w:val="Heading2Char"/>
+    <w:uiPriority w:val="9"/>
+    <w:qFormat/>
+    <w:pPr>
+      <w:keepNext/>
+      <w:keepLines/>
+      <w:spacing w:before="260" w:after="260" w:line="416" w:line-rule="auto"/>
+      <w:outlineLvl w:val="1"/>
+    </w:pPr>
+    <w:rPr>
+      <w:rFonts w:ascii="黑体" w:eastAsia="黑体" w:hAnsi="黑体"/>
+      <w:b/>
+      <w:bCs/>
+      <w:sz w:val="28"/>
+      <w:szCs w:val="28"/>
+    </w:rPr>
+  </w:style>
+  <!-- 标题3：小四号黑体 -->
+  <w:style w:type="paragraph" w:styleId="Heading3">
+    <w:name w:val="heading 3"/>
+    <w:basedOn w:val="Normal"/>
+    <w:next w:val="Normal"/>
+    <w:link w:val="Heading3Char"/>
+    <w:uiPriority w:val="9"/>
+    <w:qFormat/>
+    <w:pPr>
+      <w:keepNext/>
+      <w:keepLines/>
+      <w:spacing w:before="220" w:after="220" w:line="360" w:line-rule="auto"/>
+      <w:outlineLvl w:val="2"/>
+    </w:pPr>
+    <w:rPr>
+      <w:rFonts w:ascii="黑体" w:eastAsia="黑体" w:hAnsi="黑体"/>
+      <w:b/>
+      <w:bCs/>
+      <w:sz w:val="24"/>
+      <w:szCs w:val="24"/>
+    </w:rPr>
+  </w:style>
+  <!-- 标题4：小四号楷体 -->
+  <w:style w:type="paragraph" w:styleId="Heading4">
+    <w:name w:val="heading 4"/>
+    <w:basedOn w:val="Normal"/>
+    <w:next w:val="Normal"/>
+    <w:link w:val="Heading4Char"/>
+    <w:uiPriority w:val="9"/>
+    <w:qFormat/>
+    <w:pPr>
+      <w:keepNext/>
+      <w:keepLines/>
+      <w:spacing w:before="200" w:after="200" w:line="360" w:line-rule="auto"/>
+      <w:outlineLvl w:val="3"/>
+    </w:pPr>
+    <w:rPr>
+      <w:rFonts w:ascii="楷体" w:eastAsia="楷体" w:hAnsi="楷体"/>
+      <w:b/>
+      <w:bCs/>
+      <w:sz w:val="24"/>
+      <w:szCs w:val="24"/>
+    </w:rPr>
+  </w:style>
+  <!-- 列表段落样式 -->
   <w:style w:type="paragraph" w:styleId="ListParagraph">
     <w:name w:val="List Paragraph"/>
     <w:basedOn w:val="Normal"/>

</xml_diff>